<commit_message>
Ellucian resume: tighten to one page
Co-Authored-By: Claude Opus 5.5 <noreply@anthropic.com>
Claude-Session: https://claude.ai/code/session_01Tym7Ffe6DkggR3nyAN5h24
</commit_message>
<xml_diff>
--- a/applications/ellucian-senior-solutions-architect-presales/Ellucian-SolutionsArchitect-Resume.docx
+++ b/applications/ellucian-senior-solutions-architect-presales/Ellucian-SolutionsArchitect-Resume.docx
@@ -304,30 +304,6 @@
           <w:sz w:val="18"/>
         </w:rPr>
         <w:t>Remote</w:t>
-      </w:r>
-    </w:p>
-    <w:p>
-      <w:pPr>
-        <w:spacing w:after="30"/>
-        <w:ind w:left="259" w:hanging="259"/>
-      </w:pPr>
-      <w:r>
-        <w:rPr>
-          <w:rFonts w:ascii="Calibri" w:hAnsi="Calibri"/>
-          <w:b w:val="0"/>
-          <w:i w:val="0"/>
-          <w:color w:val="163A5F"/>
-        </w:rPr>
-        <w:t xml:space="preserve">•  </w:t>
-      </w:r>
-      <w:r>
-        <w:rPr>
-          <w:rFonts w:ascii="Calibri" w:hAnsi="Calibri"/>
-          <w:b w:val="0"/>
-          <w:i w:val="0"/>
-          <w:color w:val="1A1A1A"/>
-        </w:rPr>
-        <w:t>Presented strategy and performance analysis to multi-stakeholder client teams in QBRs, coordinating execution across internal departments.</w:t>
       </w:r>
     </w:p>
     <w:p>
@@ -639,30 +615,6 @@
           <w:i w:val="0"/>
           <w:color w:val="1A1A1A"/>
         </w:rPr>
-        <w:t>Led discovery and scoping for CRM and professional-services automation implementations, advising C-suite buyers on operational system design.</w:t>
-      </w:r>
-    </w:p>
-    <w:p>
-      <w:pPr>
-        <w:spacing w:after="30"/>
-        <w:ind w:left="259" w:hanging="259"/>
-      </w:pPr>
-      <w:r>
-        <w:rPr>
-          <w:rFonts w:ascii="Calibri" w:hAnsi="Calibri"/>
-          <w:b w:val="0"/>
-          <w:i w:val="0"/>
-          <w:color w:val="163A5F"/>
-        </w:rPr>
-        <w:t xml:space="preserve">•  </w:t>
-      </w:r>
-      <w:r>
-        <w:rPr>
-          <w:rFonts w:ascii="Calibri" w:hAnsi="Calibri"/>
-          <w:b w:val="0"/>
-          <w:i w:val="0"/>
-          <w:color w:val="1A1A1A"/>
-        </w:rPr>
         <w:t>Guided workflow design and API integrations alongside implementation teams, and built sequenced implementation plans for the transition to delivery.</w:t>
       </w:r>
     </w:p>
@@ -687,7 +639,7 @@
           <w:i w:val="0"/>
           <w:color w:val="1A1A1A"/>
         </w:rPr>
-        <w:t>Ranked top three in sales on a team of 8 to 15 while quota roughly doubled.</w:t>
+        <w:t>Led discovery and scoping with C-suite buyers, ranking top three in sales on a team of 8 to 15 while quota roughly doubled.</w:t>
       </w:r>
     </w:p>
     <w:p>
@@ -720,7 +672,7 @@
           <w:i w:val="0"/>
           <w:color w:val="1A1A1A"/>
         </w:rPr>
-        <w:t xml:space="preserve">Pre-Sales:  </w:t>
+        <w:t xml:space="preserve">Skills:  </w:t>
       </w:r>
       <w:r>
         <w:rPr>
@@ -729,30 +681,7 @@
           <w:i w:val="0"/>
           <w:color w:val="1A1A1A"/>
         </w:rPr>
-        <w:t>Discovery &amp; Workshops, Solution Design, Executive Presentations, Implementation Planning, Sales-to-Delivery Handoff</w:t>
-      </w:r>
-    </w:p>
-    <w:p>
-      <w:pPr>
-        <w:spacing w:after="30"/>
-      </w:pPr>
-      <w:r>
-        <w:rPr>
-          <w:rFonts w:ascii="Calibri" w:hAnsi="Calibri"/>
-          <w:b/>
-          <w:i w:val="0"/>
-          <w:color w:val="1A1A1A"/>
-        </w:rPr>
-        <w:t xml:space="preserve">Technical:  </w:t>
-      </w:r>
-      <w:r>
-        <w:rPr>
-          <w:rFonts w:ascii="Calibri" w:hAnsi="Calibri"/>
-          <w:b w:val="0"/>
-          <w:i w:val="0"/>
-          <w:color w:val="1A1A1A"/>
-        </w:rPr>
-        <w:t>APIs &amp; Webhooks, JavaScript &amp; Python (automation code steps), HTML/CSS, SQL, AI Agent Workflows, Zapier / Make / n8n</w:t>
+        <w:t>Discovery &amp; Workshops, Solution Design, Implementation Planning, APIs &amp; Webhooks, JavaScript &amp; Python (automation code steps), HTML/CSS, SQL, AI Agent Workflows</w:t>
       </w:r>
     </w:p>
     <w:p>

</xml_diff>